<commit_message>
Remove regional and legal metadata lines from cover and Part I
</commit_message>
<xml_diff>
--- a/downloads/SACH_IN_GIAO_TRINH_TOAN_TAP_NANG_LUC_AI_BAO_LAO_DONG.docx
+++ b/downloads/SACH_IN_GIAO_TRINH_TOAN_TAP_NANG_LUC_AI_BAO_LAO_DONG.docx
@@ -13,7 +13,7 @@
           <w:color w:val="002060"/>
           <w:sz w:val="26"/>
         </w:rPr>
-        <w:t>BÁO LAO ĐỘNG — CƠ QUAN THƯỜNG TRÚ MIỀN NAM</w:t>
+        <w:t>BÁO LAO ĐỘNG</w:t>
         <w:br/>
         <w:t>VĂN PHÒNG ĐẠI DIỆN TẠI TP. HỒ CHÍ MINH</w:t>
         <w:br/>
@@ -76,7 +76,7 @@
           <w:color w:val="003366"/>
           <w:sz w:val="24"/>
         </w:rPr>
-        <w:t>【 TÀI LIỆU HƯỚNG DẪN NGHIỆP VỤ NỘI BỘ VĂN PHÒNG — TẬP 1 】</w:t>
+        <w:t>【 TẬP 1 】</w:t>
       </w:r>
     </w:p>
     <w:p/>
@@ -93,10 +93,6 @@
           <w:color w:val="5A5A5A"/>
           <w:sz w:val="20"/>
         </w:rPr>
-        <w:t>LƯU HÀNH NỘI BỘ VĂN PHÒNG — THÁNG 10 NĂM 2026</w:t>
-        <w:br/>
-        <w:t>ĐỒNG BỘ LUẬT BÁO CHÍ SỐ 126/2025/QH15 &amp; NGHỊ ĐỊNH 237/2026/NĐ-CP</w:t>
-        <w:br/>
         <w:t>TP. HỒ CHÍ MINH</w:t>
       </w:r>
     </w:p>
@@ -957,73 +953,6 @@
           <w:sz w:val="32"/>
         </w:rPr>
         <w:t>BỐI CẢNH BÁO CHÍ HIỆN ĐẠI VÀ ỨNG DỤNG TRÍ TUỆ NHÂN TẠO (AI)</w:t>
-      </w:r>
-    </w:p>
-    <w:p>
-      <w:pPr>
-        <w:keepNext/>
-        <w:spacing w:before="200" w:after="60"/>
-        <w:ind w:firstLine="0"/>
-        <w:jc w:val="left"/>
-      </w:pPr>
-      <w:r>
-        <w:rPr>
-          <w:rFonts w:ascii="Times New Roman" w:hAnsi="Times New Roman"/>
-          <w:b/>
-          <w:color w:val="004080"/>
-          <w:sz w:val="25"/>
-        </w:rPr>
-        <w:t>TÀI LIỆU HƯỚNG DẪN NGHIỆP VỤ NỘI BỘ VĂN PHÒNG</w:t>
-      </w:r>
-    </w:p>
-    <w:p>
-      <w:pPr>
-        <w:spacing w:before="0" w:after="100" w:line="300" w:lineRule="auto"/>
-        <w:ind w:firstLine="360"/>
-        <w:jc w:val="both"/>
-      </w:pPr>
-      <w:r>
-        <w:rPr>
-          <w:rFonts w:ascii="Times New Roman" w:hAnsi="Times New Roman"/>
-          <w:b/>
-          <w:i w:val="0"/>
-          <w:sz w:val="24"/>
-        </w:rPr>
-        <w:t>Đơn vị:</w:t>
-      </w:r>
-      <w:r>
-        <w:rPr>
-          <w:rFonts w:ascii="Times New Roman" w:hAnsi="Times New Roman"/>
-          <w:b w:val="0"/>
-          <w:i w:val="0"/>
-          <w:sz w:val="24"/>
-        </w:rPr>
-        <w:t xml:space="preserve"> Văn phòng Đại diện Báo Lao Động tại TP. Hồ Chí Minh</w:t>
-      </w:r>
-    </w:p>
-    <w:p>
-      <w:pPr>
-        <w:spacing w:before="0" w:after="100" w:line="300" w:lineRule="auto"/>
-        <w:ind w:firstLine="360"/>
-        <w:jc w:val="both"/>
-      </w:pPr>
-      <w:r>
-        <w:rPr>
-          <w:rFonts w:ascii="Times New Roman" w:hAnsi="Times New Roman"/>
-          <w:b/>
-          <w:i w:val="0"/>
-          <w:sz w:val="24"/>
-        </w:rPr>
-        <w:t>Cập nhật:</w:t>
-      </w:r>
-      <w:r>
-        <w:rPr>
-          <w:rFonts w:ascii="Times New Roman" w:hAnsi="Times New Roman"/>
-          <w:b w:val="0"/>
-          <w:i w:val="0"/>
-          <w:sz w:val="24"/>
-        </w:rPr>
-        <w:t xml:space="preserve"> Tháng 10/2026 — Đồng bộ Luật Báo chí số 126/2025/QH15 &amp; Nghị định 237/2026/NĐ-CP</w:t>
       </w:r>
     </w:p>
     <w:p>
@@ -21838,10 +21767,6 @@
           <w:sz w:val="20"/>
         </w:rPr>
         <w:t>VĂN PHÒNG ĐẠI DIỆN BÁO LAO ĐỘNG TẠI TP. HỒ CHÍ MINH</w:t>
-        <w:br/>
-        <w:t>TÀI LIỆU LƯU HÀNH NỘI BỘ VĂN PHÒNG — THÁNG 10/2026</w:t>
-        <w:br/>
-        <w:t>ĐỒNG BỘ LUẬT BÁO CHÍ SỐ 126/2025/QH15 &amp; NGHỊ ĐỊNH 237/2026/NĐ-CP</w:t>
       </w:r>
     </w:p>
     <w:sectPr>

</xml_diff>

<commit_message>
Number Part I as Muc 1 and Muc 2 across all book formats
</commit_message>
<xml_diff>
--- a/downloads/SACH_IN_GIAO_TRINH_TOAN_TAP_NANG_LUC_AI_BAO_LAO_DONG.docx
+++ b/downloads/SACH_IN_GIAO_TRINH_TOAN_TAP_NANG_LUC_AI_BAO_LAO_DONG.docx
@@ -626,7 +626,7 @@
           <w:i w:val="0"/>
           <w:sz w:val="24"/>
         </w:rPr>
-        <w:t>I. Bối cảnh Báo chí Hiện đại và Sự trỗi dậy của Trí tuệ Nhân tạo</w:t>
+        <w:t>Mục 1: Bối cảnh Báo chí Hiện đại và Sự trỗi dậy của Trí tuệ Nhân tạo</w:t>
       </w:r>
     </w:p>
     <w:p>
@@ -643,7 +643,7 @@
           <w:i w:val="0"/>
           <w:sz w:val="24"/>
         </w:rPr>
-        <w:t>II. Chia sẻ Kinh nghiệm Cá nhân khi Sử dụng AI cho Tác nghiệp Báo chí (11 Kinh nghiệm Cốt lõi)</w:t>
+        <w:t>Mục 2: Chia sẻ Kinh nghiệm Cá nhân khi Sử dụng AI cho Tác nghiệp Báo chí (11 Điểm cốt lõi)</w:t>
       </w:r>
     </w:p>
     <w:p>

</xml_diff>

<commit_message>
Add watermark Copyright © Uyen Le to protect intellectual property across all editions
</commit_message>
<xml_diff>
--- a/downloads/SACH_IN_GIAO_TRINH_TOAN_TAP_NANG_LUC_AI_BAO_LAO_DONG.docx
+++ b/downloads/SACH_IN_GIAO_TRINH_TOAN_TAP_NANG_LUC_AI_BAO_LAO_DONG.docx
@@ -643,7 +643,183 @@
           <w:i w:val="0"/>
           <w:sz w:val="24"/>
         </w:rPr>
-        <w:t>Mục 2: Chia sẻ Kinh nghiệm Cá nhân khi Sử dụng AI cho Tác nghiệp Báo chí (11 Điểm cốt lõi)</w:t>
+        <w:t>Mục 2: Chia sẻ Kinh nghiệm Cá nhân khi Sử dụng AI cho Tác nghiệp Báo chí</w:t>
+      </w:r>
+    </w:p>
+    <w:p>
+      <w:pPr>
+        <w:spacing w:before="0" w:after="100" w:line="300" w:lineRule="auto"/>
+        <w:ind w:firstLine="360"/>
+        <w:jc w:val="both"/>
+      </w:pPr>
+      <w:r>
+        <w:rPr>
+          <w:rFonts w:ascii="Times New Roman" w:hAnsi="Times New Roman"/>
+          <w:b w:val="0"/>
+          <w:i w:val="0"/>
+          <w:sz w:val="24"/>
+        </w:rPr>
+        <w:t>+ 1. Bắt đầu từ vấn đề công việc, không bắt đầu từ công nghệ</w:t>
+      </w:r>
+    </w:p>
+    <w:p>
+      <w:pPr>
+        <w:spacing w:before="0" w:after="100" w:line="300" w:lineRule="auto"/>
+        <w:ind w:firstLine="360"/>
+        <w:jc w:val="both"/>
+      </w:pPr>
+      <w:r>
+        <w:rPr>
+          <w:rFonts w:ascii="Times New Roman" w:hAnsi="Times New Roman"/>
+          <w:b w:val="0"/>
+          <w:i w:val="0"/>
+          <w:sz w:val="24"/>
+        </w:rPr>
+        <w:t>+ 2. Giao vai trò cho AI và tạo cho nó đủ ngữ cảnh</w:t>
+      </w:r>
+    </w:p>
+    <w:p>
+      <w:pPr>
+        <w:spacing w:before="0" w:after="100" w:line="300" w:lineRule="auto"/>
+        <w:ind w:firstLine="360"/>
+        <w:jc w:val="both"/>
+      </w:pPr>
+      <w:r>
+        <w:rPr>
+          <w:rFonts w:ascii="Times New Roman" w:hAnsi="Times New Roman"/>
+          <w:b w:val="0"/>
+          <w:i w:val="0"/>
+          <w:sz w:val="24"/>
+        </w:rPr>
+        <w:t>+ 3. Quét rộng, nghiên cứu sâu, lọc mạnh và chú ý những dấu hiệu bất thường</w:t>
+      </w:r>
+    </w:p>
+    <w:p>
+      <w:pPr>
+        <w:spacing w:before="0" w:after="100" w:line="300" w:lineRule="auto"/>
+        <w:ind w:firstLine="360"/>
+        <w:jc w:val="both"/>
+      </w:pPr>
+      <w:r>
+        <w:rPr>
+          <w:rFonts w:ascii="Times New Roman" w:hAnsi="Times New Roman"/>
+          <w:b w:val="0"/>
+          <w:i w:val="0"/>
+          <w:sz w:val="24"/>
+        </w:rPr>
+        <w:t>+ 4. Phân biệt dữ kiện, tín hiệu và giả thuyết; đọc chéo quyết sách, dữ liệu và đời sống</w:t>
+      </w:r>
+    </w:p>
+    <w:p>
+      <w:pPr>
+        <w:spacing w:before="0" w:after="100" w:line="300" w:lineRule="auto"/>
+        <w:ind w:firstLine="360"/>
+        <w:jc w:val="both"/>
+      </w:pPr>
+      <w:r>
+        <w:rPr>
+          <w:rFonts w:ascii="Times New Roman" w:hAnsi="Times New Roman"/>
+          <w:b w:val="0"/>
+          <w:i w:val="0"/>
+          <w:sz w:val="24"/>
+        </w:rPr>
+        <w:t>+ 5. Đừng chỉ hỏi “có tin gì”, hãy tìm xem “cái gì đang thay đổi”</w:t>
+      </w:r>
+    </w:p>
+    <w:p>
+      <w:pPr>
+        <w:spacing w:before="0" w:after="100" w:line="300" w:lineRule="auto"/>
+        <w:ind w:firstLine="360"/>
+        <w:jc w:val="both"/>
+      </w:pPr>
+      <w:r>
+        <w:rPr>
+          <w:rFonts w:ascii="Times New Roman" w:hAnsi="Times New Roman"/>
+          <w:b w:val="0"/>
+          <w:i w:val="0"/>
+          <w:sz w:val="24"/>
+        </w:rPr>
+        <w:t>+ 6. Một ý tưởng chỉ có giá trị khi đi được tới tác nghiệp</w:t>
+      </w:r>
+    </w:p>
+    <w:p>
+      <w:pPr>
+        <w:spacing w:before="0" w:after="100" w:line="300" w:lineRule="auto"/>
+        <w:ind w:firstLine="360"/>
+        <w:jc w:val="both"/>
+      </w:pPr>
+      <w:r>
+        <w:rPr>
+          <w:rFonts w:ascii="Times New Roman" w:hAnsi="Times New Roman"/>
+          <w:b w:val="0"/>
+          <w:i w:val="0"/>
+          <w:sz w:val="24"/>
+        </w:rPr>
+        <w:t>+ 7. Dùng AI như một đối thủ phản biện, không phải người đồng tình</w:t>
+      </w:r>
+    </w:p>
+    <w:p>
+      <w:pPr>
+        <w:spacing w:before="0" w:after="100" w:line="300" w:lineRule="auto"/>
+        <w:ind w:firstLine="360"/>
+        <w:jc w:val="both"/>
+      </w:pPr>
+      <w:r>
+        <w:rPr>
+          <w:rFonts w:ascii="Times New Roman" w:hAnsi="Times New Roman"/>
+          <w:b w:val="0"/>
+          <w:i w:val="0"/>
+          <w:sz w:val="24"/>
+        </w:rPr>
+        <w:t>+ 8. Dùng AI trước khi viết, không bắt đầu từ tiêu đề</w:t>
+      </w:r>
+    </w:p>
+    <w:p>
+      <w:pPr>
+        <w:spacing w:before="0" w:after="100" w:line="300" w:lineRule="auto"/>
+        <w:ind w:firstLine="360"/>
+        <w:jc w:val="both"/>
+      </w:pPr>
+      <w:r>
+        <w:rPr>
+          <w:rFonts w:ascii="Times New Roman" w:hAnsi="Times New Roman"/>
+          <w:b w:val="0"/>
+          <w:i w:val="0"/>
+          <w:sz w:val="24"/>
+        </w:rPr>
+        <w:t>+ 9. Đầu ra đầu tiên hiếm khi là đầu ra cuối cùng</w:t>
+      </w:r>
+    </w:p>
+    <w:p>
+      <w:pPr>
+        <w:spacing w:before="0" w:after="100" w:line="300" w:lineRule="auto"/>
+        <w:ind w:firstLine="360"/>
+        <w:jc w:val="both"/>
+      </w:pPr>
+      <w:r>
+        <w:rPr>
+          <w:rFonts w:ascii="Times New Roman" w:hAnsi="Times New Roman"/>
+          <w:b w:val="0"/>
+          <w:i w:val="0"/>
+          <w:sz w:val="24"/>
+        </w:rPr>
+        <w:t>+ 10. Từ prompt cá nhân đến hệ thống tri thức của tòa soạn</w:t>
+      </w:r>
+    </w:p>
+    <w:p>
+      <w:pPr>
+        <w:spacing w:before="0" w:after="100" w:line="300" w:lineRule="auto"/>
+        <w:ind w:firstLine="360"/>
+        <w:jc w:val="both"/>
+      </w:pPr>
+      <w:r>
+        <w:rPr>
+          <w:rFonts w:ascii="Times New Roman" w:hAnsi="Times New Roman"/>
+          <w:b w:val="0"/>
+          <w:i w:val="0"/>
+          <w:sz w:val="24"/>
+        </w:rPr>
+        <w:t>+ 11. Ranh giới cuối cùng vẫn là trách nhiệm nghề nghiệp của con người</w:t>
       </w:r>
     </w:p>
     <w:p>

</xml_diff>

<commit_message>
Update Word document with Copyright © Uyen Le footer
</commit_message>
<xml_diff>
--- a/downloads/SACH_IN_GIAO_TRINH_TOAN_TAP_NANG_LUC_AI_BAO_LAO_DONG.docx
+++ b/downloads/SACH_IN_GIAO_TRINH_TOAN_TAP_NANG_LUC_AI_BAO_LAO_DONG.docx
@@ -21963,24 +21963,16 @@
   <w:p>
     <w:pPr>
       <w:pStyle w:val="Footer"/>
-      <w:jc w:val="center"/>
+      <w:jc w:val="right"/>
     </w:pPr>
     <w:r>
       <w:rPr>
         <w:rFonts w:ascii="Times New Roman" w:hAnsi="Times New Roman"/>
-        <w:color w:val="505050"/>
-        <w:sz w:val="19"/>
-      </w:rPr>
-      <w:t xml:space="preserve">— </w:t>
-    </w:r>
-    <w:fldSimple w:instr="PAGE"/>
-    <w:r>
-      <w:rPr>
-        <w:rFonts w:ascii="Times New Roman" w:hAnsi="Times New Roman"/>
-        <w:color w:val="505050"/>
-        <w:sz w:val="19"/>
-      </w:rPr>
-      <w:t xml:space="preserve"> —</w:t>
+        <w:i/>
+        <w:color w:val="A0A0A0"/>
+        <w:sz w:val="17"/>
+      </w:rPr>
+      <w:t>Copyright © Uyen Le — Tài liệu lưu hành nội bộ</w:t>
     </w:r>
   </w:p>
 </w:ftr>

</xml_diff>

<commit_message>
Add conclusion: Neu nha bao khong cap nhat va lam chu AI thi sao to personal sharing section across all formats
</commit_message>
<xml_diff>
--- a/downloads/SACH_IN_GIAO_TRINH_TOAN_TAP_NANG_LUC_AI_BAO_LAO_DONG.docx
+++ b/downloads/SACH_IN_GIAO_TRINH_TOAN_TAP_NANG_LUC_AI_BAO_LAO_DONG.docx
@@ -820,6 +820,22 @@
           <w:sz w:val="24"/>
         </w:rPr>
         <w:t>+ 11. Ranh giới cuối cùng vẫn là trách nhiệm nghề nghiệp của con người</w:t>
+      </w:r>
+    </w:p>
+    <w:p>
+      <w:pPr>
+        <w:spacing w:before="0" w:after="100" w:line="300" w:lineRule="auto"/>
+        <w:ind w:firstLine="360"/>
+        <w:jc w:val="both"/>
+      </w:pPr>
+      <w:r>
+        <w:rPr>
+          <w:rFonts w:ascii="Times New Roman" w:hAnsi="Times New Roman"/>
+          <w:b w:val="0"/>
+          <w:i w:val="0"/>
+          <w:sz w:val="24"/>
+        </w:rPr>
+        <w:t>+ Đúc kết: Nếu nhà báo không cập nhật và làm chủ AI thì sao?</w:t>
       </w:r>
     </w:p>
     <w:p>
@@ -5483,6 +5499,512 @@
           <w:sz w:val="24"/>
         </w:rPr>
         <w:t>Trong rất nhiều thông tin đang xuất hiện, điều gì thực sự đáng để một nhà báo dành thời gian kiểm chứng và theo đuổi?</w:t>
+      </w:r>
+    </w:p>
+    <w:p>
+      <w:pPr>
+        <w:spacing w:before="120" w:after="120"/>
+        <w:ind w:firstLine="0"/>
+        <w:pBdr>
+          <w:bottom w:val="single" w:sz="8" w:space="1" w:color="003366"/>
+        </w:pBdr>
+      </w:pPr>
+    </w:p>
+    <w:p>
+      <w:pPr>
+        <w:keepNext/>
+        <w:spacing w:before="280" w:after="100"/>
+        <w:ind w:firstLine="0"/>
+        <w:jc w:val="left"/>
+        <w:pBdr>
+          <w:bottom w:val="single" w:sz="6" w:space="2" w:color="003366"/>
+        </w:pBdr>
+      </w:pPr>
+      <w:r>
+        <w:rPr>
+          <w:rFonts w:ascii="Times New Roman" w:hAnsi="Times New Roman"/>
+          <w:b/>
+          <w:color w:val="003366"/>
+          <w:sz w:val="27"/>
+        </w:rPr>
+        <w:t>Nếu nhà báo không cập nhật và làm chủ AI thì sao?</w:t>
+      </w:r>
+    </w:p>
+    <w:p>
+      <w:pPr>
+        <w:spacing w:before="0" w:after="100" w:line="300" w:lineRule="auto"/>
+        <w:ind w:firstLine="360"/>
+        <w:jc w:val="both"/>
+      </w:pPr>
+      <w:r>
+        <w:rPr>
+          <w:rFonts w:ascii="Times New Roman" w:hAnsi="Times New Roman"/>
+          <w:b w:val="0"/>
+          <w:i w:val="0"/>
+          <w:sz w:val="24"/>
+        </w:rPr>
+        <w:t>Tôi không cho rằng AI sẽ đơn giản thay thế nhà báo. Nhưng tôi cho rằng một nhà báo không cập nhật cách làm việc với AI sẽ ngày càng bất lợi trước một nhà báo có cùng năng lực nghề nghiệp nhưng biết sử dụng công cụ này tốt.</w:t>
+      </w:r>
+    </w:p>
+    <w:p>
+      <w:pPr>
+        <w:spacing w:before="0" w:after="100" w:line="300" w:lineRule="auto"/>
+        <w:ind w:firstLine="360"/>
+        <w:jc w:val="both"/>
+      </w:pPr>
+      <w:r>
+        <w:rPr>
+          <w:rFonts w:ascii="Times New Roman" w:hAnsi="Times New Roman"/>
+          <w:b w:val="0"/>
+          <w:i w:val="0"/>
+          <w:sz w:val="24"/>
+        </w:rPr>
+        <w:t>Khoảng cách trước hết nằm ở tốc độ xử lý thông tin.</w:t>
+      </w:r>
+    </w:p>
+    <w:p>
+      <w:pPr>
+        <w:spacing w:before="0" w:after="100" w:line="300" w:lineRule="auto"/>
+        <w:ind w:firstLine="360"/>
+        <w:jc w:val="both"/>
+      </w:pPr>
+      <w:r>
+        <w:rPr>
+          <w:rFonts w:ascii="Times New Roman" w:hAnsi="Times New Roman"/>
+          <w:b w:val="0"/>
+          <w:i w:val="0"/>
+          <w:sz w:val="24"/>
+        </w:rPr>
+        <w:t>Một người có thể mất vài giờ để tìm tài liệu, lần lại một chính sách, đối chiếu nhiều nguồn hoặc dựng lịch sử một dự án. Với AI và các công cụ nghiên cứu phù hợp, phần việc chuẩn bị đó có thể được rút ngắn đáng kể. Thời gian tiết kiệm được có thể dành cho những việc quan trọng hơn: gọi nguồn, kiểm chứng, đi hiện trường, phỏng vấn và suy nghĩ về câu chuyện.</w:t>
+      </w:r>
+    </w:p>
+    <w:p>
+      <w:pPr>
+        <w:spacing w:before="0" w:after="100" w:line="300" w:lineRule="auto"/>
+        <w:ind w:firstLine="360"/>
+        <w:jc w:val="both"/>
+      </w:pPr>
+      <w:r>
+        <w:rPr>
+          <w:rFonts w:ascii="Times New Roman" w:hAnsi="Times New Roman"/>
+          <w:b w:val="0"/>
+          <w:i w:val="0"/>
+          <w:sz w:val="24"/>
+        </w:rPr>
+        <w:t>Nhưng tốc độ chưa phải điều đáng lo nhất.</w:t>
+      </w:r>
+    </w:p>
+    <w:p>
+      <w:pPr>
+        <w:spacing w:before="0" w:after="100" w:line="300" w:lineRule="auto"/>
+        <w:ind w:firstLine="360"/>
+        <w:jc w:val="both"/>
+      </w:pPr>
+      <w:r>
+        <w:rPr>
+          <w:rFonts w:ascii="Times New Roman" w:hAnsi="Times New Roman"/>
+          <w:b w:val="0"/>
+          <w:i w:val="0"/>
+          <w:sz w:val="24"/>
+        </w:rPr>
+        <w:t xml:space="preserve">Điều đáng ngại hơn là </w:t>
+      </w:r>
+      <w:r>
+        <w:rPr>
+          <w:rFonts w:ascii="Times New Roman" w:hAnsi="Times New Roman"/>
+          <w:b/>
+          <w:i w:val="0"/>
+          <w:sz w:val="24"/>
+        </w:rPr>
+        <w:t>khoảng cách về khả năng nhìn thấy vấn đề</w:t>
+      </w:r>
+      <w:r>
+        <w:rPr>
+          <w:rFonts w:ascii="Times New Roman" w:hAnsi="Times New Roman"/>
+          <w:b w:val="0"/>
+          <w:i w:val="0"/>
+          <w:sz w:val="24"/>
+        </w:rPr>
+        <w:t>.</w:t>
+      </w:r>
+    </w:p>
+    <w:p>
+      <w:pPr>
+        <w:spacing w:before="0" w:after="100" w:line="300" w:lineRule="auto"/>
+        <w:ind w:firstLine="360"/>
+        <w:jc w:val="both"/>
+      </w:pPr>
+      <w:r>
+        <w:rPr>
+          <w:rFonts w:ascii="Times New Roman" w:hAnsi="Times New Roman"/>
+          <w:b w:val="0"/>
+          <w:i w:val="0"/>
+          <w:sz w:val="24"/>
+        </w:rPr>
+        <w:t>Khi biết dùng AI để quét nguồn, đọc một lượng tài liệu lớn, đối chiếu dữ liệu, dựng timeline, tìm bất thường và đặt các lớp thông tin cạnh nhau, một nhà báo có thể nhận ra những tín hiệu mà cách làm thủ công dễ bỏ qua. Nếu không có năng lực đó, người làm báo rất dễ chỉ chạy theo những gì đã hiện rõ trên mặt báo, mạng xã hội hoặc thông cáo.</w:t>
+      </w:r>
+    </w:p>
+    <w:p>
+      <w:pPr>
+        <w:spacing w:before="0" w:after="100" w:line="300" w:lineRule="auto"/>
+        <w:ind w:firstLine="360"/>
+        <w:jc w:val="both"/>
+      </w:pPr>
+      <w:r>
+        <w:rPr>
+          <w:rFonts w:ascii="Times New Roman" w:hAnsi="Times New Roman"/>
+          <w:b w:val="0"/>
+          <w:i w:val="0"/>
+          <w:sz w:val="24"/>
+        </w:rPr>
+        <w:t xml:space="preserve">Khi ấy, bất lợi không còn là viết chậm hơn vài chục phút. Đó là nguy cơ </w:t>
+      </w:r>
+      <w:r>
+        <w:rPr>
+          <w:rFonts w:ascii="Times New Roman" w:hAnsi="Times New Roman"/>
+          <w:b/>
+          <w:i w:val="0"/>
+          <w:sz w:val="24"/>
+        </w:rPr>
+        <w:t>phát hiện vấn đề muộn hơn</w:t>
+      </w:r>
+      <w:r>
+        <w:rPr>
+          <w:rFonts w:ascii="Times New Roman" w:hAnsi="Times New Roman"/>
+          <w:b w:val="0"/>
+          <w:i w:val="0"/>
+          <w:sz w:val="24"/>
+        </w:rPr>
+        <w:t>.</w:t>
+      </w:r>
+    </w:p>
+    <w:p>
+      <w:pPr>
+        <w:spacing w:before="0" w:after="100" w:line="300" w:lineRule="auto"/>
+        <w:ind w:firstLine="360"/>
+        <w:jc w:val="both"/>
+      </w:pPr>
+      <w:r>
+        <w:rPr>
+          <w:rFonts w:ascii="Times New Roman" w:hAnsi="Times New Roman"/>
+          <w:b w:val="0"/>
+          <w:i w:val="0"/>
+          <w:sz w:val="24"/>
+        </w:rPr>
+        <w:t>Một rủi ro khác là sự phụ thuộc vào những người biết dùng AI.</w:t>
+      </w:r>
+    </w:p>
+    <w:p>
+      <w:pPr>
+        <w:spacing w:before="0" w:after="100" w:line="300" w:lineRule="auto"/>
+        <w:ind w:firstLine="360"/>
+        <w:jc w:val="both"/>
+      </w:pPr>
+      <w:r>
+        <w:rPr>
+          <w:rFonts w:ascii="Times New Roman" w:hAnsi="Times New Roman"/>
+          <w:b w:val="0"/>
+          <w:i w:val="0"/>
+          <w:sz w:val="24"/>
+        </w:rPr>
+        <w:t>Nếu bản thân phóng viên không hiểu công cụ, họ khó đánh giá được một kết quả AI đưa ra đúng đến đâu, nguồn có đáng tin không, đâu là dữ kiện và đâu chỉ là suy luận. Người không hiểu AI không hẳn an toàn hơn trước sai sót của AI; đôi khi ngược lại, họ dễ tin hoặc dễ bị dẫn dắt hơn vì không biết công cụ đang vận hành như thế nào.</w:t>
+      </w:r>
+    </w:p>
+    <w:p>
+      <w:pPr>
+        <w:spacing w:before="0" w:after="100" w:line="300" w:lineRule="auto"/>
+        <w:ind w:firstLine="360"/>
+        <w:jc w:val="both"/>
+      </w:pPr>
+      <w:r>
+        <w:rPr>
+          <w:rFonts w:ascii="Times New Roman" w:hAnsi="Times New Roman"/>
+          <w:b w:val="0"/>
+          <w:i w:val="0"/>
+          <w:sz w:val="24"/>
+        </w:rPr>
+        <w:t>Vì vậy, “không dùng AI” không đồng nghĩa với “không chịu rủi ro từ AI”. Khi AI ngày càng tham gia vào tìm kiếm, sản xuất nội dung, mạng xã hội, truyền thông doanh nghiệp và cả cách công chúng tiếp nhận thông tin, nhà báo vẫn phải hiểu nó để nhận diện nội dung tổng hợp, dữ liệu giả, hình ảnh giả, thao túng thông tin và những phương thức truyền thông mới.</w:t>
+      </w:r>
+    </w:p>
+    <w:p>
+      <w:pPr>
+        <w:spacing w:before="0" w:after="100" w:line="300" w:lineRule="auto"/>
+        <w:ind w:firstLine="360"/>
+        <w:jc w:val="both"/>
+      </w:pPr>
+      <w:r>
+        <w:rPr>
+          <w:rFonts w:ascii="Times New Roman" w:hAnsi="Times New Roman"/>
+          <w:b w:val="0"/>
+          <w:i w:val="0"/>
+          <w:sz w:val="24"/>
+        </w:rPr>
+        <w:t>Ở cấp độ tòa soạn, khoảng cách này còn rõ hơn.</w:t>
+      </w:r>
+    </w:p>
+    <w:p>
+      <w:pPr>
+        <w:spacing w:before="0" w:after="100" w:line="300" w:lineRule="auto"/>
+        <w:ind w:firstLine="360"/>
+        <w:jc w:val="both"/>
+      </w:pPr>
+      <w:r>
+        <w:rPr>
+          <w:rFonts w:ascii="Times New Roman" w:hAnsi="Times New Roman"/>
+          <w:b w:val="0"/>
+          <w:i w:val="0"/>
+          <w:sz w:val="24"/>
+        </w:rPr>
+        <w:t>Một đơn vị biết dùng AI để theo dõi thông tin, xây kho dữ liệu, quản lý tri thức, phân tích hiệu quả nội dung và hỗ trợ biên tập có thể tăng năng lực của cả đội ngũ. Một đơn vị vẫn làm mọi việc theo cách thủ công sẽ phải sử dụng nhiều thời gian và nhân lực hơn cho những công việc lặp lại.</w:t>
+      </w:r>
+    </w:p>
+    <w:p>
+      <w:pPr>
+        <w:spacing w:before="0" w:after="100" w:line="300" w:lineRule="auto"/>
+        <w:ind w:firstLine="360"/>
+        <w:jc w:val="both"/>
+      </w:pPr>
+      <w:r>
+        <w:rPr>
+          <w:rFonts w:ascii="Times New Roman" w:hAnsi="Times New Roman"/>
+          <w:b w:val="0"/>
+          <w:i w:val="0"/>
+          <w:sz w:val="24"/>
+        </w:rPr>
+        <w:t>Điều đó không có nghĩa mọi phóng viên phải trở thành kỹ sư AI.</w:t>
+      </w:r>
+    </w:p>
+    <w:p>
+      <w:pPr>
+        <w:spacing w:before="0" w:after="100" w:line="300" w:lineRule="auto"/>
+        <w:ind w:firstLine="360"/>
+        <w:jc w:val="both"/>
+      </w:pPr>
+      <w:r>
+        <w:rPr>
+          <w:rFonts w:ascii="Times New Roman" w:hAnsi="Times New Roman"/>
+          <w:b w:val="0"/>
+          <w:i w:val="0"/>
+          <w:sz w:val="24"/>
+        </w:rPr>
+        <w:t>Nhưng theo tôi, sử dụng AI sẽ dần trở thành một phần của năng lực nghề nghiệp, tương tự như trước đây nhà báo phải học sử dụng công cụ tìm kiếm, dữ liệu số, điện thoại thông minh, mạng xã hội hay các nền tảng xuất bản mới.</w:t>
+      </w:r>
+    </w:p>
+    <w:p>
+      <w:pPr>
+        <w:spacing w:before="0" w:after="100" w:line="300" w:lineRule="auto"/>
+        <w:ind w:firstLine="360"/>
+        <w:jc w:val="both"/>
+      </w:pPr>
+      <w:r>
+        <w:rPr>
+          <w:rFonts w:ascii="Times New Roman" w:hAnsi="Times New Roman"/>
+          <w:b w:val="0"/>
+          <w:i w:val="0"/>
+          <w:sz w:val="24"/>
+        </w:rPr>
+        <w:t>Điều cần học không phải là thuộc thật nhiều prompt.</w:t>
+      </w:r>
+    </w:p>
+    <w:p>
+      <w:pPr>
+        <w:spacing w:before="0" w:after="100" w:line="300" w:lineRule="auto"/>
+        <w:ind w:firstLine="360"/>
+        <w:jc w:val="both"/>
+      </w:pPr>
+      <w:r>
+        <w:rPr>
+          <w:rFonts w:ascii="Times New Roman" w:hAnsi="Times New Roman"/>
+          <w:b w:val="0"/>
+          <w:i w:val="0"/>
+          <w:sz w:val="24"/>
+        </w:rPr>
+        <w:t>Quan trọng hơn là biết AI làm tốt việc gì, yếu ở đâu, khi nào cần nghiên cứu sâu, khi nào phải kiểm tra lại nguồn, dữ liệu nào không nên đưa vào hệ thống, và lúc nào phải ngừng sử dụng AI để quay về với nguồn tin và hiện trường.</w:t>
+      </w:r>
+    </w:p>
+    <w:p>
+      <w:pPr>
+        <w:spacing w:before="0" w:after="100" w:line="300" w:lineRule="auto"/>
+        <w:ind w:firstLine="360"/>
+        <w:jc w:val="both"/>
+      </w:pPr>
+      <w:r>
+        <w:rPr>
+          <w:rFonts w:ascii="Times New Roman" w:hAnsi="Times New Roman"/>
+          <w:b w:val="0"/>
+          <w:i w:val="0"/>
+          <w:sz w:val="24"/>
+        </w:rPr>
+        <w:t xml:space="preserve">Có một nghịch lý đáng chú ý: </w:t>
+      </w:r>
+      <w:r>
+        <w:rPr>
+          <w:rFonts w:ascii="Times New Roman" w:hAnsi="Times New Roman"/>
+          <w:b/>
+          <w:i w:val="0"/>
+          <w:sz w:val="24"/>
+        </w:rPr>
+        <w:t>AI càng phát triển, những năng lực cốt lõi của nghề báo càng trở nên quan trọng.</w:t>
+      </w:r>
+    </w:p>
+    <w:p>
+      <w:pPr>
+        <w:spacing w:before="0" w:after="100" w:line="300" w:lineRule="auto"/>
+        <w:ind w:firstLine="360"/>
+        <w:jc w:val="both"/>
+      </w:pPr>
+      <w:r>
+        <w:rPr>
+          <w:rFonts w:ascii="Times New Roman" w:hAnsi="Times New Roman"/>
+          <w:b w:val="0"/>
+          <w:i w:val="0"/>
+          <w:sz w:val="24"/>
+        </w:rPr>
+        <w:t>Khả năng đặt câu hỏi.</w:t>
+      </w:r>
+    </w:p>
+    <w:p>
+      <w:pPr>
+        <w:spacing w:before="0" w:after="100" w:line="300" w:lineRule="auto"/>
+        <w:ind w:firstLine="360"/>
+        <w:jc w:val="both"/>
+      </w:pPr>
+      <w:r>
+        <w:rPr>
+          <w:rFonts w:ascii="Times New Roman" w:hAnsi="Times New Roman"/>
+          <w:b w:val="0"/>
+          <w:i w:val="0"/>
+          <w:sz w:val="24"/>
+        </w:rPr>
+        <w:t>Khả năng phân biệt điều quan trọng với điều ồn ào.</w:t>
+      </w:r>
+    </w:p>
+    <w:p>
+      <w:pPr>
+        <w:spacing w:before="0" w:after="100" w:line="300" w:lineRule="auto"/>
+        <w:ind w:firstLine="360"/>
+        <w:jc w:val="both"/>
+      </w:pPr>
+      <w:r>
+        <w:rPr>
+          <w:rFonts w:ascii="Times New Roman" w:hAnsi="Times New Roman"/>
+          <w:b w:val="0"/>
+          <w:i w:val="0"/>
+          <w:sz w:val="24"/>
+        </w:rPr>
+        <w:t>Khả năng đánh giá nguồn tin.</w:t>
+      </w:r>
+    </w:p>
+    <w:p>
+      <w:pPr>
+        <w:spacing w:before="0" w:after="100" w:line="300" w:lineRule="auto"/>
+        <w:ind w:firstLine="360"/>
+        <w:jc w:val="both"/>
+      </w:pPr>
+      <w:r>
+        <w:rPr>
+          <w:rFonts w:ascii="Times New Roman" w:hAnsi="Times New Roman"/>
+          <w:b w:val="0"/>
+          <w:i w:val="0"/>
+          <w:sz w:val="24"/>
+        </w:rPr>
+        <w:t>Khả năng quan sát con người.</w:t>
+      </w:r>
+    </w:p>
+    <w:p>
+      <w:pPr>
+        <w:spacing w:before="0" w:after="100" w:line="300" w:lineRule="auto"/>
+        <w:ind w:firstLine="360"/>
+        <w:jc w:val="both"/>
+      </w:pPr>
+      <w:r>
+        <w:rPr>
+          <w:rFonts w:ascii="Times New Roman" w:hAnsi="Times New Roman"/>
+          <w:b w:val="0"/>
+          <w:i w:val="0"/>
+          <w:sz w:val="24"/>
+        </w:rPr>
+        <w:t>Khả năng hoài nghi một kết luận có vẻ quá thuận tai.</w:t>
+      </w:r>
+    </w:p>
+    <w:p>
+      <w:pPr>
+        <w:spacing w:before="0" w:after="100" w:line="300" w:lineRule="auto"/>
+        <w:ind w:firstLine="360"/>
+        <w:jc w:val="both"/>
+      </w:pPr>
+      <w:r>
+        <w:rPr>
+          <w:rFonts w:ascii="Times New Roman" w:hAnsi="Times New Roman"/>
+          <w:b w:val="0"/>
+          <w:i w:val="0"/>
+          <w:sz w:val="24"/>
+        </w:rPr>
+        <w:t>Và cuối cùng là trách nhiệm đối với thông tin mình công bố.</w:t>
+      </w:r>
+    </w:p>
+    <w:p>
+      <w:pPr>
+        <w:spacing w:before="0" w:after="100" w:line="300" w:lineRule="auto"/>
+        <w:ind w:firstLine="360"/>
+        <w:jc w:val="both"/>
+      </w:pPr>
+      <w:r>
+        <w:rPr>
+          <w:rFonts w:ascii="Times New Roman" w:hAnsi="Times New Roman"/>
+          <w:b w:val="0"/>
+          <w:i w:val="0"/>
+          <w:sz w:val="24"/>
+        </w:rPr>
+        <w:t>AI không làm những phẩm chất đó bớt quan trọng. Nó chỉ khiến sự khác biệt giữa người có và không có những phẩm chất đó hiện ra nhanh hơn.</w:t>
+      </w:r>
+    </w:p>
+    <w:p>
+      <w:pPr>
+        <w:spacing w:before="0" w:after="100" w:line="300" w:lineRule="auto"/>
+        <w:ind w:firstLine="360"/>
+        <w:jc w:val="both"/>
+      </w:pPr>
+      <w:r>
+        <w:rPr>
+          <w:rFonts w:ascii="Times New Roman" w:hAnsi="Times New Roman"/>
+          <w:b w:val="0"/>
+          <w:i w:val="0"/>
+          <w:sz w:val="24"/>
+        </w:rPr>
+        <w:t>Vì vậy, theo tôi, lựa chọn của người làm báo không còn đơn giản là “có dùng AI hay không”.</w:t>
+      </w:r>
+    </w:p>
+    <w:p>
+      <w:pPr>
+        <w:spacing w:before="0" w:after="100" w:line="300" w:lineRule="auto"/>
+        <w:ind w:firstLine="360"/>
+        <w:jc w:val="both"/>
+      </w:pPr>
+      <w:r>
+        <w:rPr>
+          <w:rFonts w:ascii="Times New Roman" w:hAnsi="Times New Roman"/>
+          <w:b w:val="0"/>
+          <w:i w:val="0"/>
+          <w:sz w:val="24"/>
+        </w:rPr>
+        <w:t>Câu hỏi đúng hơn là:</w:t>
+      </w:r>
+    </w:p>
+    <w:p>
+      <w:pPr>
+        <w:spacing w:before="0" w:after="100" w:line="300" w:lineRule="auto"/>
+        <w:ind w:firstLine="360"/>
+        <w:jc w:val="both"/>
+      </w:pPr>
+      <w:r>
+        <w:rPr>
+          <w:rFonts w:ascii="Times New Roman" w:hAnsi="Times New Roman"/>
+          <w:b/>
+          <w:i w:val="0"/>
+          <w:sz w:val="24"/>
+        </w:rPr>
+        <w:t>Mình sẽ làm chủ AI để tăng năng lực nghề nghiệp, hay để những người làm chủ AI dần tạo ra khoảng cách với mình?</w:t>
       </w:r>
     </w:p>
     <w:p>

</xml_diff>

<commit_message>
Cap nhat toan van Loi noi dau moi cua tac gia Le Thanh Uyen
</commit_message>
<xml_diff>
--- a/downloads/SACH_IN_GIAO_TRINH_TOAN_TAP_NANG_LUC_AI_BAO_LAO_DONG.docx
+++ b/downloads/SACH_IN_GIAO_TRINH_TOAN_TAP_NANG_LUC_AI_BAO_LAO_DONG.docx
@@ -885,218 +885,396 @@
           <w:spacing w:val="0"/>
           <w:color w:val="2D2116"/>
         </w:rPr>
-        <w:t xml:space="preserve">Thân gửi các anh em phóng viên trong văn phòng,</w:t>
-      </w:r>
-    </w:p>
-    <w:p>
-      <w:pPr>
-        <w:jc w:val="both"/>
-        <w:spacing w:after="320"/>
-      </w:pPr>
-      <w:r>
-        <w:rPr>
-          <w:rFonts w:ascii="Helvetica Neue" w:hAnsi="Helvetica Neue" w:cs="Helvetica Neue"/>
-          <w:sz w:val="34"/>
-          <w:sz-cs w:val="34"/>
-          <w:spacing w:val="0"/>
-          <w:color w:val="2D2116"/>
-        </w:rPr>
-        <w:t xml:space="preserve">Sự phát triển nhanh chóng của công nghệ và các công cụ trí tuệ nhân tạo (AI) đang làm thay đổi đáng kể phương thức tác nghiệp hằng ngày của người làm báo. Từ việc tìm kiếm thông tin, gỡ băng phỏng vấn, rà soát văn bản cho đến trực quan hóa số liệu và sản xuất sản phẩm đa phương tiện, công nghệ đang mở ra những cách làm việc mới hiệu quả và tiết kiệm thời gian hơn.</w:t>
-      </w:r>
-    </w:p>
-    <w:p>
-      <w:pPr>
-        <w:jc w:val="both"/>
-        <w:spacing w:after="320"/>
-      </w:pPr>
-      <w:r>
-        <w:rPr>
-          <w:rFonts w:ascii="Helvetica Neue" w:hAnsi="Helvetica Neue" w:cs="Helvetica Neue"/>
-          <w:sz w:val="34"/>
-          <w:sz-cs w:val="34"/>
-          <w:spacing w:val="0"/>
-          <w:color w:val="2D2116"/>
-        </w:rPr>
-        <w:t xml:space="preserve">Tuy nhiên, công nghệ càng phát triển thì yêu cầu đối với bản lĩnh và trách nhiệm của người cầm bút lại càng cao. Máy móc có thể giúp chúng ta rút ngắn các khâu cơ học, nhưng tuyệt đối không thể thay thế phóng viên đi thực tế hiện trường, đối thoại trực tiếp với nhân vật, kiểm chứng sự thật và bảo vệ quyền lợi chính đáng của người dân, người lao động.</w:t>
-      </w:r>
-    </w:p>
-    <w:p>
-      <w:pPr>
-        <w:jc w:val="both"/>
-        <w:spacing w:after="320"/>
-      </w:pPr>
-      <w:r>
-        <w:rPr>
-          <w:rFonts w:ascii="Helvetica Neue" w:hAnsi="Helvetica Neue" w:cs="Helvetica Neue"/>
-          <w:sz w:val="34"/>
-          <w:sz-cs w:val="34"/>
-          <w:spacing w:val="0"/>
-          <w:color w:val="2D2116"/>
-        </w:rPr>
-        <w:t xml:space="preserve">Cuốn cẩm nang nghiệp vụ này được lãnh đạo văn phòng tổng hợp và biên soạn dành riêng cho các anh em phóng viên của văn phòng chúng ta. Mục tiêu là giúp mỗi anh em:</w:t>
-      </w:r>
-    </w:p>
-    <w:p>
-      <w:pPr>
-        <w:jc w:val="both"/>
-        <w:ind w:left="720" w:first-line="-720"/>
-        <w:spacing w:after="160"/>
-      </w:pPr>
-      <w:r>
-        <w:rPr>
-          <w:rFonts w:ascii="Helvetica Neue" w:hAnsi="Helvetica Neue" w:cs="Helvetica Neue"/>
-          <w:sz w:val="34"/>
-          <w:sz-cs w:val="34"/>
-          <w:b/>
-          <w:color w:val="2D2116"/>
-        </w:rPr>
-        <w:t xml:space="preserve"/>
-        <w:tab/>
-        <w:t xml:space="preserve">1</w:t>
-        <w:tab/>
-        <w:t xml:space="preserve"/>
-      </w:r>
-      <w:r>
-        <w:rPr>
-          <w:rFonts w:ascii="Helvetica Neue" w:hAnsi="Helvetica Neue" w:cs="Helvetica Neue"/>
-          <w:sz w:val="34"/>
-          <w:sz-cs w:val="34"/>
-          <w:b/>
-          <w:spacing w:val="0"/>
-          <w:color w:val="2D2116"/>
-        </w:rPr>
-        <w:t xml:space="preserve">Hiểu đúng bản chất và làm chủ công cụ:</w:t>
-      </w:r>
-      <w:r>
-        <w:rPr>
-          <w:rFonts w:ascii="Helvetica Neue" w:hAnsi="Helvetica Neue" w:cs="Helvetica Neue"/>
-          <w:sz w:val="34"/>
-          <w:sz-cs w:val="34"/>
-          <w:spacing w:val="0"/>
-          <w:color w:val="2D2116"/>
-        </w:rPr>
-        <w:t xml:space="preserve"> Nắm vững nguyên lý hoạt động của AI để khai thác hiệu quả, nhận diện và phòng ngừa hiện tượng thông tin ảo giác, tuyệt đối không phụ thuộc vào máy móc.</w:t>
-      </w:r>
-    </w:p>
-    <w:p>
-      <w:pPr>
-        <w:jc w:val="both"/>
-        <w:ind w:left="720" w:first-line="-720"/>
-        <w:spacing w:after="160"/>
-      </w:pPr>
-      <w:r>
-        <w:rPr>
-          <w:rFonts w:ascii="Helvetica Neue" w:hAnsi="Helvetica Neue" w:cs="Helvetica Neue"/>
-          <w:sz w:val="34"/>
-          <w:sz-cs w:val="34"/>
-          <w:b/>
-          <w:color w:val="2D2116"/>
-        </w:rPr>
-        <w:t xml:space="preserve"/>
-        <w:tab/>
-        <w:t xml:space="preserve">2</w:t>
-        <w:tab/>
-        <w:t xml:space="preserve"/>
-      </w:r>
-      <w:r>
-        <w:rPr>
-          <w:rFonts w:ascii="Helvetica Neue" w:hAnsi="Helvetica Neue" w:cs="Helvetica Neue"/>
-          <w:sz w:val="34"/>
-          <w:sz-cs w:val="34"/>
-          <w:b/>
-          <w:spacing w:val="0"/>
-          <w:color w:val="2D2116"/>
-        </w:rPr>
-        <w:t xml:space="preserve">Tiết kiệm thời gian, nâng cao năng suất:</w:t>
-      </w:r>
-      <w:r>
-        <w:rPr>
-          <w:rFonts w:ascii="Helvetica Neue" w:hAnsi="Helvetica Neue" w:cs="Helvetica Neue"/>
-          <w:sz w:val="34"/>
-          <w:sz-cs w:val="34"/>
-          <w:spacing w:val="0"/>
-          <w:color w:val="2D2116"/>
-        </w:rPr>
-        <w:t xml:space="preserve"> Tự động hóa các phần việc bàn giấy thủ công (bóc băng ghi âm, tóm tắt hồ sơ lớn, tra cứu quy định pháp lý) để dành tối đa thời gian trực tiếp bám sát hiện trường và đào sâu đề tài.</w:t>
-      </w:r>
-    </w:p>
-    <w:p>
-      <w:pPr>
-        <w:jc w:val="both"/>
-        <w:ind w:left="720" w:first-line="-720"/>
-        <w:spacing w:after="160"/>
-      </w:pPr>
-      <w:r>
-        <w:rPr>
-          <w:rFonts w:ascii="Helvetica Neue" w:hAnsi="Helvetica Neue" w:cs="Helvetica Neue"/>
-          <w:sz w:val="34"/>
-          <w:sz-cs w:val="34"/>
-          <w:b/>
-          <w:color w:val="2D2116"/>
-        </w:rPr>
-        <w:t xml:space="preserve"/>
-        <w:tab/>
-        <w:t xml:space="preserve">3</w:t>
-        <w:tab/>
-        <w:t xml:space="preserve"/>
-      </w:r>
-      <w:r>
-        <w:rPr>
-          <w:rFonts w:ascii="Helvetica Neue" w:hAnsi="Helvetica Neue" w:cs="Helvetica Neue"/>
-          <w:sz w:val="34"/>
-          <w:sz-cs w:val="34"/>
-          <w:b/>
-          <w:spacing w:val="0"/>
-          <w:color w:val="2D2116"/>
-        </w:rPr>
-        <w:t xml:space="preserve">Tác nghiệp đa dạng mảng và giữ vững đạo đức nghề nghiệp:</w:t>
-      </w:r>
-      <w:r>
-        <w:rPr>
-          <w:rFonts w:ascii="Helvetica Neue" w:hAnsi="Helvetica Neue" w:cs="Helvetica Neue"/>
-          <w:sz w:val="34"/>
-          <w:sz-cs w:val="34"/>
-          <w:spacing w:val="0"/>
-          <w:color w:val="2D2116"/>
-        </w:rPr>
-        <w:t xml:space="preserve"> Áp dụng linh hoạt vào mọi mảng nội dung mà văn phòng đang phụ trách — từ kinh tế đô thị, thị trường, pháp luật, cải cách chính sách đến đời sống dân sinh; luôn tuân thủ nghiêm ngặt </w:t>
-      </w:r>
-      <w:r>
-        <w:rPr>
-          <w:rFonts w:ascii="Helvetica Neue" w:hAnsi="Helvetica Neue" w:cs="Helvetica Neue"/>
-          <w:sz w:val="34"/>
-          <w:sz-cs w:val="34"/>
-          <w:b/>
-          <w:spacing w:val="0"/>
-          <w:color w:val="2D2116"/>
-        </w:rPr>
-        <w:t xml:space="preserve">Luật Báo chí số 126/2025/QH15</w:t>
-      </w:r>
-      <w:r>
-        <w:rPr>
-          <w:rFonts w:ascii="Helvetica Neue" w:hAnsi="Helvetica Neue" w:cs="Helvetica Neue"/>
-          <w:sz w:val="34"/>
-          <w:sz-cs w:val="34"/>
-          <w:spacing w:val="0"/>
-          <w:color w:val="2D2116"/>
-        </w:rPr>
-        <w:t xml:space="preserve"> và các quy định bảo vệ dữ liệu cá nhân.</w:t>
-      </w:r>
-    </w:p>
-    <w:p>
-      <w:pPr>
-        <w:jc w:val="both"/>
-        <w:spacing w:after="320"/>
-      </w:pPr>
-      <w:r>
-        <w:rPr>
-          <w:rFonts w:ascii="Helvetica Neue" w:hAnsi="Helvetica Neue" w:cs="Helvetica Neue"/>
-          <w:sz w:val="34"/>
-          <w:sz-cs w:val="34"/>
-          <w:spacing w:val="0"/>
-          <w:color w:val="2D2116"/>
-        </w:rPr>
-        <w:t xml:space="preserve">Mong rằng cuốn tài liệu này sẽ là người bạn đồng hành thiết thực, hỗ trợ các anh em tác nghiệp an toàn, nhanh chóng và ngày càng nâng cao chất lượng tác phẩm báo chí của văn phòng mình.</w:t>
+        <w:t xml:space="preserve">Cuốn tài liệu này bắt đầu từ một nhu cầu rất thực tế.</w:t>
+      </w:r>
+    </w:p>
+    <w:p>
+      <w:pPr>
+        <w:jc w:val="both"/>
+        <w:spacing w:after="320"/>
+      </w:pPr>
+      <w:r>
+        <w:rPr>
+          <w:rFonts w:ascii="Helvetica Neue" w:hAnsi="Helvetica Neue" w:cs="Helvetica Neue"/>
+          <w:sz w:val="34"/>
+          <w:sz-cs w:val="34"/>
+          <w:spacing w:val="0"/>
+          <w:color w:val="2D2116"/>
+        </w:rPr>
+        <w:t xml:space="preserve">Trong công việc hằng ngày, tôi nhận ra AI đang đi vào nghề báo nhanh hơn nhiều so với cách chúng ta thường hình dung. Nó không chỉ xuất hiện ở khâu viết. AI đã có thể tham gia từ lúc tìm kiếm thông tin, đọc hàng trăm trang tài liệu, gỡ băng, xử lý dữ liệu, chuẩn bị phỏng vấn, nghiên cứu một vấn đề, phát hiện những dấu hiệu bất thường cho tới phản biện một đề tài trước khi phóng viên ra hiện trường.</w:t>
+      </w:r>
+    </w:p>
+    <w:p>
+      <w:pPr>
+        <w:jc w:val="both"/>
+        <w:spacing w:after="320"/>
+      </w:pPr>
+      <w:r>
+        <w:rPr>
+          <w:rFonts w:ascii="Helvetica Neue" w:hAnsi="Helvetica Neue" w:cs="Helvetica Neue"/>
+          <w:sz w:val="34"/>
+          <w:sz-cs w:val="34"/>
+          <w:spacing w:val="0"/>
+          <w:color w:val="2D2116"/>
+        </w:rPr>
+        <w:t xml:space="preserve">Nếu biết sử dụng đúng, nhiều phần việc trước đây mất hàng giờ có thể được rút ngắn đáng kể. Quan trọng hơn, AI có thể giúp người làm báo mở rộng phạm vi thông tin mình tiếp cận, đọc chéo nhiều nguồn và đặt ra những câu hỏi mà trong áp lực công việc hằng ngày chúng ta có thể bỏ qua.</w:t>
+      </w:r>
+    </w:p>
+    <w:p>
+      <w:pPr>
+        <w:jc w:val="both"/>
+        <w:spacing w:after="320"/>
+      </w:pPr>
+      <w:r>
+        <w:rPr>
+          <w:rFonts w:ascii="Helvetica Neue" w:hAnsi="Helvetica Neue" w:cs="Helvetica Neue"/>
+          <w:sz w:val="34"/>
+          <w:sz-cs w:val="34"/>
+          <w:spacing w:val="0"/>
+          <w:color w:val="2D2116"/>
+        </w:rPr>
+        <w:t xml:space="preserve">Nhưng càng sử dụng nhiều, tôi càng thấy một điều khác: AI không tự làm cho báo chí tốt hơn.</w:t>
+      </w:r>
+    </w:p>
+    <w:p>
+      <w:pPr>
+        <w:jc w:val="both"/>
+        <w:spacing w:after="320"/>
+      </w:pPr>
+      <w:r>
+        <w:rPr>
+          <w:rFonts w:ascii="Helvetica Neue" w:hAnsi="Helvetica Neue" w:cs="Helvetica Neue"/>
+          <w:sz w:val="34"/>
+          <w:sz-cs w:val="34"/>
+          <w:spacing w:val="0"/>
+          <w:color w:val="2D2116"/>
+        </w:rPr>
+        <w:t xml:space="preserve">Một công cụ có thể tìm được rất nhiều dữ liệu nhưng không biết dữ liệu nào thực sự đáng quan tâm. Nó có thể đưa ra một lập luận rất mạch lạc nhưng lập luận đó vẫn có thể được xây trên một giả định sai. Nó có thể tạo ra câu chữ trôi chảy nhưng không thể thay phóng viên kiểm chứng sự thật, xây dựng nguồn tin, quan sát đời sống hay chịu trách nhiệm về thông tin đã công bố.</w:t>
+      </w:r>
+    </w:p>
+    <w:p>
+      <w:pPr>
+        <w:jc w:val="both"/>
+        <w:spacing w:after="320"/>
+      </w:pPr>
+      <w:r>
+        <w:rPr>
+          <w:rFonts w:ascii="Helvetica Neue" w:hAnsi="Helvetica Neue" w:cs="Helvetica Neue"/>
+          <w:sz w:val="34"/>
+          <w:sz-cs w:val="34"/>
+          <w:spacing w:val="0"/>
+          <w:color w:val="2D2116"/>
+        </w:rPr>
+        <w:t xml:space="preserve">Vì vậy, điều cần học không đơn giản là cách sử dụng một vài công cụ AI.</w:t>
+      </w:r>
+    </w:p>
+    <w:p>
+      <w:pPr>
+        <w:jc w:val="both"/>
+        <w:spacing w:after="320"/>
+      </w:pPr>
+      <w:r>
+        <w:rPr>
+          <w:rFonts w:ascii="Helvetica Neue" w:hAnsi="Helvetica Neue" w:cs="Helvetica Neue"/>
+          <w:sz w:val="34"/>
+          <w:sz-cs w:val="34"/>
+          <w:spacing w:val="0"/>
+          <w:color w:val="2D2116"/>
+        </w:rPr>
+        <w:t xml:space="preserve">Điều quan trọng hơn là biết </w:t>
+      </w:r>
+      <w:r>
+        <w:rPr>
+          <w:rFonts w:ascii="Helvetica Neue" w:hAnsi="Helvetica Neue" w:cs="Helvetica Neue"/>
+          <w:sz w:val="34"/>
+          <w:sz-cs w:val="34"/>
+          <w:b/>
+          <w:spacing w:val="0"/>
+          <w:color w:val="2D2116"/>
+        </w:rPr>
+        <w:t xml:space="preserve">AI làm tốt việc gì, làm chưa tốt việc gì và chúng ta phải đặt nó ở đâu trong quy trình làm báo</w:t>
+      </w:r>
+      <w:r>
+        <w:rPr>
+          <w:rFonts w:ascii="Helvetica Neue" w:hAnsi="Helvetica Neue" w:cs="Helvetica Neue"/>
+          <w:sz w:val="34"/>
+          <w:sz-cs w:val="34"/>
+          <w:spacing w:val="0"/>
+          <w:color w:val="2D2116"/>
+        </w:rPr>
+        <w:t xml:space="preserve">.</w:t>
+      </w:r>
+    </w:p>
+    <w:p>
+      <w:pPr>
+        <w:jc w:val="both"/>
+        <w:spacing w:after="320"/>
+      </w:pPr>
+      <w:r>
+        <w:rPr>
+          <w:rFonts w:ascii="Helvetica Neue" w:hAnsi="Helvetica Neue" w:cs="Helvetica Neue"/>
+          <w:sz w:val="34"/>
+          <w:sz-cs w:val="34"/>
+          <w:spacing w:val="0"/>
+          <w:color w:val="2D2116"/>
+        </w:rPr>
+        <w:t xml:space="preserve">Đây cũng là lý do tôi không muốn tài liệu này trở thành một tập hợp các câu lệnh có sẵn. Công cụ sẽ thay đổi rất nhanh. Những cái tên đang phổ biến hôm nay có thể được thay thế chỉ sau vài tháng. Nhưng các năng lực như biết xác định đúng vấn đề, nghiên cứu nhiều nguồn, kiểm tra dữ kiện, phát hiện khoảng trống, đặt giả thuyết, tự phản biện và chuyển thông tin thành kế hoạch tác nghiệp sẽ còn cần thiết lâu dài.</w:t>
+      </w:r>
+    </w:p>
+    <w:p>
+      <w:pPr>
+        <w:jc w:val="both"/>
+        <w:spacing w:after="320"/>
+      </w:pPr>
+      <w:r>
+        <w:rPr>
+          <w:rFonts w:ascii="Helvetica Neue" w:hAnsi="Helvetica Neue" w:cs="Helvetica Neue"/>
+          <w:sz w:val="34"/>
+          <w:sz-cs w:val="34"/>
+          <w:spacing w:val="0"/>
+          <w:color w:val="2D2116"/>
+        </w:rPr>
+        <w:t xml:space="preserve">Trong quá trình sử dụng AI, tôi cũng nhận ra rằng khoảng cách đáng chú ý trong thời gian tới có lẽ không đơn giản là giữa con người và máy móc. Khoảng cách có thể xuất hiện ngay trong chính đội ngũ làm nghề: giữa những người biết tận dụng AI để tăng năng lực nghiên cứu, phát hiện và xử lý công việc với những người vẫn hoàn toàn đứng ngoài sự thay đổi này.</w:t>
+      </w:r>
+    </w:p>
+    <w:p>
+      <w:pPr>
+        <w:jc w:val="both"/>
+        <w:spacing w:after="320"/>
+      </w:pPr>
+      <w:r>
+        <w:rPr>
+          <w:rFonts w:ascii="Helvetica Neue" w:hAnsi="Helvetica Neue" w:cs="Helvetica Neue"/>
+          <w:sz w:val="34"/>
+          <w:sz-cs w:val="34"/>
+          <w:spacing w:val="0"/>
+          <w:color w:val="2D2116"/>
+        </w:rPr>
+        <w:t xml:space="preserve">Một phóng viên không nhất thiết phải trở thành chuyên gia công nghệ. Nhưng người làm báo cần hiểu những công cụ đang ngày càng tham gia sâu vào chính môi trường thông tin mà mình tác nghiệp.</w:t>
+      </w:r>
+    </w:p>
+    <w:p>
+      <w:pPr>
+        <w:jc w:val="both"/>
+        <w:spacing w:after="320"/>
+      </w:pPr>
+      <w:r>
+        <w:rPr>
+          <w:rFonts w:ascii="Helvetica Neue" w:hAnsi="Helvetica Neue" w:cs="Helvetica Neue"/>
+          <w:sz w:val="34"/>
+          <w:sz-cs w:val="34"/>
+          <w:spacing w:val="0"/>
+          <w:color w:val="2D2116"/>
+        </w:rPr>
+        <w:t xml:space="preserve">Hiểu để sử dụng.</w:t>
+      </w:r>
+    </w:p>
+    <w:p>
+      <w:pPr>
+        <w:jc w:val="both"/>
+        <w:spacing w:after="320"/>
+      </w:pPr>
+      <w:r>
+        <w:rPr>
+          <w:rFonts w:ascii="Helvetica Neue" w:hAnsi="Helvetica Neue" w:cs="Helvetica Neue"/>
+          <w:sz w:val="34"/>
+          <w:sz-cs w:val="34"/>
+          <w:spacing w:val="0"/>
+          <w:color w:val="2D2116"/>
+        </w:rPr>
+        <w:t xml:space="preserve">Hiểu để kiểm soát.</w:t>
+      </w:r>
+    </w:p>
+    <w:p>
+      <w:pPr>
+        <w:jc w:val="both"/>
+        <w:spacing w:after="320"/>
+      </w:pPr>
+      <w:r>
+        <w:rPr>
+          <w:rFonts w:ascii="Helvetica Neue" w:hAnsi="Helvetica Neue" w:cs="Helvetica Neue"/>
+          <w:sz w:val="34"/>
+          <w:sz-cs w:val="34"/>
+          <w:spacing w:val="0"/>
+          <w:color w:val="2D2116"/>
+        </w:rPr>
+        <w:t xml:space="preserve">Và cũng phải hiểu để biết khi nào không nên sử dụng.</w:t>
+      </w:r>
+    </w:p>
+    <w:p>
+      <w:pPr>
+        <w:jc w:val="both"/>
+        <w:spacing w:after="320"/>
+      </w:pPr>
+      <w:r>
+        <w:rPr>
+          <w:rFonts w:ascii="Helvetica Neue" w:hAnsi="Helvetica Neue" w:cs="Helvetica Neue"/>
+          <w:sz w:val="34"/>
+          <w:sz-cs w:val="34"/>
+          <w:spacing w:val="0"/>
+          <w:color w:val="2D2116"/>
+        </w:rPr>
+        <w:t xml:space="preserve">Từ những thử nghiệm, những lần AI trả lời tốt, cả những lần nó trả lời rất tệ, tôi dần hình thành một số cách làm cho công việc của mình và sau đó chia sẻ với các phóng viên trong văn phòng. Tài liệu này được hình thành từ chính quá trình đó.</w:t>
+      </w:r>
+    </w:p>
+    <w:p>
+      <w:pPr>
+        <w:jc w:val="both"/>
+        <w:spacing w:after="320"/>
+      </w:pPr>
+      <w:r>
+        <w:rPr>
+          <w:rFonts w:ascii="Helvetica Neue" w:hAnsi="Helvetica Neue" w:cs="Helvetica Neue"/>
+          <w:sz w:val="34"/>
+          <w:sz-cs w:val="34"/>
+          <w:spacing w:val="0"/>
+          <w:color w:val="2D2116"/>
+        </w:rPr>
+        <w:t xml:space="preserve">Nó không đặt mục tiêu thay đổi những nguyên tắc căn bản của nghề báo. Ngược lại, càng đi sâu vào AI, tôi càng thấy những nguyên tắc ấy trở nên quan trọng hơn: phải có nguồn, phải kiểm chứng, phải phân biệt dữ kiện với suy luận, phải đến hiện trường khi cần, phải tôn trọng nhân vật và cuối cùng phải chịu trách nhiệm về thông tin mình công bố.</w:t>
+      </w:r>
+    </w:p>
+    <w:p>
+      <w:pPr>
+        <w:jc w:val="both"/>
+        <w:spacing w:after="320"/>
+      </w:pPr>
+      <w:r>
+        <w:rPr>
+          <w:rFonts w:ascii="Helvetica Neue" w:hAnsi="Helvetica Neue" w:cs="Helvetica Neue"/>
+          <w:sz w:val="34"/>
+          <w:sz-cs w:val="34"/>
+          <w:spacing w:val="0"/>
+          <w:color w:val="2D2116"/>
+        </w:rPr>
+        <w:t xml:space="preserve">AI có thể giúp chúng ta đọc nhanh hơn, tìm rộng hơn và xử lý nhiều thông tin hơn.</w:t>
+      </w:r>
+    </w:p>
+    <w:p>
+      <w:pPr>
+        <w:jc w:val="both"/>
+        <w:spacing w:after="320"/>
+      </w:pPr>
+      <w:r>
+        <w:rPr>
+          <w:rFonts w:ascii="Helvetica Neue" w:hAnsi="Helvetica Neue" w:cs="Helvetica Neue"/>
+          <w:sz w:val="34"/>
+          <w:sz-cs w:val="34"/>
+          <w:spacing w:val="0"/>
+          <w:color w:val="2D2116"/>
+        </w:rPr>
+        <w:t xml:space="preserve">Nhưng nhà báo vẫn phải quyết định </w:t>
+      </w:r>
+      <w:r>
+        <w:rPr>
+          <w:rFonts w:ascii="Helvetica Neue" w:hAnsi="Helvetica Neue" w:cs="Helvetica Neue"/>
+          <w:sz w:val="34"/>
+          <w:sz-cs w:val="34"/>
+          <w:b/>
+          <w:spacing w:val="0"/>
+          <w:color w:val="2D2116"/>
+        </w:rPr>
+        <w:t xml:space="preserve">điều gì đáng để theo đuổi, điều gì đủ căn cứ để công bố và điều gì có ý nghĩa đối với công chúng</w:t>
+      </w:r>
+      <w:r>
+        <w:rPr>
+          <w:rFonts w:ascii="Helvetica Neue" w:hAnsi="Helvetica Neue" w:cs="Helvetica Neue"/>
+          <w:sz w:val="34"/>
+          <w:sz-cs w:val="34"/>
+          <w:spacing w:val="0"/>
+          <w:color w:val="2D2116"/>
+        </w:rPr>
+        <w:t xml:space="preserve">.</w:t>
+      </w:r>
+    </w:p>
+    <w:p>
+      <w:pPr>
+        <w:jc w:val="both"/>
+        <w:spacing w:after="320"/>
+      </w:pPr>
+      <w:r>
+        <w:rPr>
+          <w:rFonts w:ascii="Helvetica Neue" w:hAnsi="Helvetica Neue" w:cs="Helvetica Neue"/>
+          <w:sz w:val="34"/>
+          <w:sz-cs w:val="34"/>
+          <w:spacing w:val="0"/>
+          <w:color w:val="2D2116"/>
+        </w:rPr>
+        <w:t xml:space="preserve">Tôi mong cuốn tài liệu này trước hết vì mong muốn giúp các anh em phóng viên trong Văn phòng giảm bớt những phần việc cơ học để dành nhiều thời gian hơn cho những việc máy móc chưa thể làm thay: đi, gặp, hỏi, quan sát, kiểm chứng và phát hiện.</w:t>
+      </w:r>
+    </w:p>
+    <w:p>
+      <w:pPr>
+        <w:jc w:val="both"/>
+        <w:spacing w:after="320"/>
+      </w:pPr>
+      <w:r>
+        <w:rPr>
+          <w:rFonts w:ascii="Helvetica Neue" w:hAnsi="Helvetica Neue" w:cs="Helvetica Neue"/>
+          <w:sz w:val="34"/>
+          <w:sz-cs w:val="34"/>
+          <w:spacing w:val="0"/>
+          <w:color w:val="2D2116"/>
+        </w:rPr>
+        <w:t xml:space="preserve">Xa hơn, tôi mong mỗi người có thể từng bước xây cho mình một cách làm việc mới với AI, không phụ thuộc vào nó nhưng cũng không đứng ngoài nó.</w:t>
+      </w:r>
+    </w:p>
+    <w:p>
+      <w:pPr>
+        <w:jc w:val="both"/>
+        <w:spacing w:after="320"/>
+      </w:pPr>
+      <w:r>
+        <w:rPr>
+          <w:rFonts w:ascii="Helvetica Neue" w:hAnsi="Helvetica Neue" w:cs="Helvetica Neue"/>
+          <w:sz w:val="34"/>
+          <w:sz-cs w:val="34"/>
+          <w:spacing w:val="0"/>
+          <w:color w:val="2D2116"/>
+        </w:rPr>
+        <w:t xml:space="preserve">Bởi trong một môi trường thông tin ngày càng lớn và ngày càng nhanh, câu hỏi không còn chỉ là chúng ta có dùng AI hay không.</w:t>
+      </w:r>
+    </w:p>
+    <w:p>
+      <w:pPr>
+        <w:jc w:val="both"/>
+        <w:spacing w:after="320"/>
+      </w:pPr>
+      <w:r>
+        <w:rPr>
+          <w:rFonts w:ascii="Helvetica Neue" w:hAnsi="Helvetica Neue" w:cs="Helvetica Neue"/>
+          <w:sz w:val="34"/>
+          <w:sz-cs w:val="34"/>
+          <w:spacing w:val="0"/>
+          <w:color w:val="2D2116"/>
+        </w:rPr>
+        <w:t xml:space="preserve">Quan trọng hơn là:</w:t>
+      </w:r>
+    </w:p>
+    <w:p>
+      <w:pPr>
+        <w:jc w:val="both"/>
+        <w:spacing w:after="320"/>
+      </w:pPr>
+      <w:r>
+        <w:rPr>
+          <w:rFonts w:ascii="Helvetica Neue" w:hAnsi="Helvetica Neue" w:cs="Helvetica Neue"/>
+          <w:sz w:val="34"/>
+          <w:sz-cs w:val="34"/>
+          <w:b/>
+          <w:spacing w:val="0"/>
+          <w:color w:val="2D2116"/>
+        </w:rPr>
+        <w:t xml:space="preserve">Chúng ta sẽ sử dụng AI như thế nào để trở thành những nhà báo tốt hơn?</w:t>
+      </w:r>
+      <w:r>
+        <w:rPr>
+          <w:rFonts w:ascii="Helvetica Neue" w:hAnsi="Helvetica Neue" w:cs="Helvetica Neue"/>
+          <w:sz w:val="34"/>
+          <w:sz-cs w:val="34"/>
+          <w:spacing w:val="0"/>
+          <w:color w:val="2D2116"/>
+        </w:rPr>
+        <w:t xml:space="preserve"/>
       </w:r>
     </w:p>
     <w:p>

</xml_diff>